<commit_message>
Adding Additional Test Documents
</commit_message>
<xml_diff>
--- a/Profile Insights/About me.docx
+++ b/Profile Insights/About me.docx
@@ -404,7 +404,25 @@
           <w:lang w:eastAsia="en-IN"/>
           <w14:ligatures w14:val="none"/>
         </w:rPr>
-        <w:t xml:space="preserve">His technical skills include various testing types, programming languages (Java, Python), and frameworks (Cypress, TestNG). </w:t>
+        <w:t>His technical skills include various testing types, programming languages (Java, Python), and frameworks (</w:t>
+      </w:r>
+      <w:r>
+        <w:rPr>
+          <w:rFonts w:ascii="Aptos" w:eastAsia="Times New Roman" w:hAnsi="Aptos" w:cs="Times New Roman"/>
+          <w:kern w:val="0"/>
+          <w:lang w:eastAsia="en-IN"/>
+          <w14:ligatures w14:val="none"/>
+        </w:rPr>
+        <w:t xml:space="preserve">Selenium, </w:t>
+      </w:r>
+      <w:r>
+        <w:rPr>
+          <w:rFonts w:ascii="Aptos" w:eastAsia="Times New Roman" w:hAnsi="Aptos" w:cs="Times New Roman"/>
+          <w:kern w:val="0"/>
+          <w:lang w:eastAsia="en-IN"/>
+          <w14:ligatures w14:val="none"/>
+        </w:rPr>
+        <w:t xml:space="preserve">Cypress, TestNG). </w:t>
       </w:r>
       <w:r>
         <w:rPr>
@@ -537,6 +555,352 @@
           <w14:ligatures w14:val="none"/>
         </w:rPr>
         <w:t>Haryish is based in Chennai, Tamil Nadu, and can be reached via phone or email, with links to his portfolio and GitHub.</w:t>
+      </w:r>
+    </w:p>
+    <w:p>
+      <w:r>
+        <w:br w:type="page"/>
+      </w:r>
+    </w:p>
+    <w:p>
+      <w:pPr>
+        <w:rPr>
+          <w:b/>
+          <w:bCs/>
+        </w:rPr>
+      </w:pPr>
+      <w:r>
+        <w:rPr>
+          <w:b/>
+          <w:bCs/>
+        </w:rPr>
+        <w:lastRenderedPageBreak/>
+        <w:t>LinkedIn “Projects” Section</w:t>
+      </w:r>
+    </w:p>
+    <w:p>
+      <w:r>
+        <w:t xml:space="preserve">Add your </w:t>
+      </w:r>
+      <w:proofErr w:type="spellStart"/>
+      <w:r>
+        <w:t>DemoQA</w:t>
+      </w:r>
+      <w:proofErr w:type="spellEnd"/>
+      <w:r>
+        <w:t xml:space="preserve"> Automation Framework as a </w:t>
+      </w:r>
+      <w:r>
+        <w:rPr>
+          <w:b/>
+          <w:bCs/>
+        </w:rPr>
+        <w:t>Project</w:t>
+      </w:r>
+      <w:r>
+        <w:t>:</w:t>
+      </w:r>
+    </w:p>
+    <w:p>
+      <w:pPr>
+        <w:numPr>
+          <w:ilvl w:val="0"/>
+          <w:numId w:val="11"/>
+        </w:numPr>
+      </w:pPr>
+      <w:r>
+        <w:rPr>
+          <w:b/>
+          <w:bCs/>
+        </w:rPr>
+        <w:t>Project name:</w:t>
+      </w:r>
+      <w:r>
+        <w:t xml:space="preserve"> </w:t>
+      </w:r>
+      <w:proofErr w:type="spellStart"/>
+      <w:r>
+        <w:t>DemoQA</w:t>
+      </w:r>
+      <w:proofErr w:type="spellEnd"/>
+      <w:r>
+        <w:t xml:space="preserve"> Automation Framework (CI/CD + Automation Testing)</w:t>
+      </w:r>
+    </w:p>
+    <w:p>
+      <w:pPr>
+        <w:numPr>
+          <w:ilvl w:val="0"/>
+          <w:numId w:val="11"/>
+        </w:numPr>
+      </w:pPr>
+      <w:r>
+        <w:rPr>
+          <w:b/>
+          <w:bCs/>
+        </w:rPr>
+        <w:t>Description:</w:t>
+      </w:r>
+      <w:r>
+        <w:t xml:space="preserve"> Designed and implemented a scalable automation framework with TestNG, Selenium, Maven, and CI/CD pipelines.</w:t>
+      </w:r>
+    </w:p>
+    <w:p>
+      <w:pPr>
+        <w:numPr>
+          <w:ilvl w:val="1"/>
+          <w:numId w:val="11"/>
+        </w:numPr>
+      </w:pPr>
+      <w:r>
+        <w:t>Built modular test suites (</w:t>
+      </w:r>
+      <w:proofErr w:type="spellStart"/>
+      <w:r>
+        <w:t>HealthCheck</w:t>
+      </w:r>
+      <w:proofErr w:type="spellEnd"/>
+      <w:r>
+        <w:t>, Smoke, Regression).</w:t>
+      </w:r>
+    </w:p>
+    <w:p>
+      <w:pPr>
+        <w:numPr>
+          <w:ilvl w:val="1"/>
+          <w:numId w:val="11"/>
+        </w:numPr>
+      </w:pPr>
+      <w:r>
+        <w:t>Integrated Jenkins and GitHub Actions for automated builds.</w:t>
+      </w:r>
+    </w:p>
+    <w:p>
+      <w:pPr>
+        <w:numPr>
+          <w:ilvl w:val="1"/>
+          <w:numId w:val="11"/>
+        </w:numPr>
+      </w:pPr>
+      <w:r>
+        <w:t>Applied Page Object Model, data-driven testing, and logging best practices.</w:t>
+      </w:r>
+    </w:p>
+    <w:p>
+      <w:pPr>
+        <w:numPr>
+          <w:ilvl w:val="1"/>
+          <w:numId w:val="11"/>
+        </w:numPr>
+      </w:pPr>
+      <w:r>
+        <w:t>Collaborated with AI contributors (Microsoft Copilot &amp; ChatGPT) for framework design, documentation, and CI/CD setup.</w:t>
+      </w:r>
+    </w:p>
+    <w:p>
+      <w:pPr>
+        <w:numPr>
+          <w:ilvl w:val="0"/>
+          <w:numId w:val="11"/>
+        </w:numPr>
+      </w:pPr>
+      <w:r>
+        <w:rPr>
+          <w:b/>
+          <w:bCs/>
+        </w:rPr>
+        <w:t>Contributors:</w:t>
+      </w:r>
+    </w:p>
+    <w:p>
+      <w:pPr>
+        <w:numPr>
+          <w:ilvl w:val="1"/>
+          <w:numId w:val="11"/>
+        </w:numPr>
+      </w:pPr>
+      <w:r>
+        <w:t>Haryish Elangumaran (Author &amp; QA Lead)</w:t>
+      </w:r>
+    </w:p>
+    <w:p>
+      <w:pPr>
+        <w:numPr>
+          <w:ilvl w:val="1"/>
+          <w:numId w:val="11"/>
+        </w:numPr>
+      </w:pPr>
+      <w:r>
+        <w:t>Microsoft Copilot (Mentor &amp; Framework Design Guidance)</w:t>
+      </w:r>
+    </w:p>
+    <w:p>
+      <w:pPr>
+        <w:numPr>
+          <w:ilvl w:val="1"/>
+          <w:numId w:val="11"/>
+        </w:numPr>
+      </w:pPr>
+      <w:r>
+        <w:t>ChatGPT (Documentation &amp; Technical Writing Support)</w:t>
+      </w:r>
+    </w:p>
+    <w:p>
+      <w:r>
+        <w:rPr>
+          <w:rFonts w:ascii="Segoe UI Emoji" w:hAnsi="Segoe UI Emoji" w:cs="Segoe UI Emoji"/>
+        </w:rPr>
+        <w:t>👉</w:t>
+      </w:r>
+      <w:r>
+        <w:t xml:space="preserve"> On LinkedIn, you can tag yourself and list Copilot/ChatGPT as collaborators in the description (since they don’t have LinkedIn profiles).</w:t>
+      </w:r>
+    </w:p>
+    <w:p>
+      <w:pPr>
+        <w:rPr>
+          <w:b/>
+          <w:bCs/>
+        </w:rPr>
+      </w:pPr>
+      <w:r>
+        <w:rPr>
+          <w:rFonts w:ascii="Segoe UI Emoji" w:hAnsi="Segoe UI Emoji" w:cs="Segoe UI Emoji"/>
+          <w:b/>
+          <w:bCs/>
+        </w:rPr>
+        <w:t>🔹</w:t>
+      </w:r>
+      <w:r>
+        <w:rPr>
+          <w:b/>
+          <w:bCs/>
+        </w:rPr>
+        <w:t xml:space="preserve"> Resume / Job Portals</w:t>
+      </w:r>
+    </w:p>
+    <w:p>
+      <w:r>
+        <w:t xml:space="preserve">Add under </w:t>
+      </w:r>
+      <w:r>
+        <w:rPr>
+          <w:b/>
+          <w:bCs/>
+        </w:rPr>
+        <w:t>Projects / Contributions</w:t>
+      </w:r>
+      <w:r>
+        <w:t xml:space="preserve">: </w:t>
+      </w:r>
+      <w:proofErr w:type="spellStart"/>
+      <w:r>
+        <w:rPr>
+          <w:b/>
+          <w:bCs/>
+        </w:rPr>
+        <w:t>DemoQA</w:t>
+      </w:r>
+      <w:proofErr w:type="spellEnd"/>
+      <w:r>
+        <w:rPr>
+          <w:b/>
+          <w:bCs/>
+        </w:rPr>
+        <w:t xml:space="preserve"> Automation Framework (Open Source, 2025)</w:t>
+      </w:r>
+    </w:p>
+    <w:p>
+      <w:pPr>
+        <w:numPr>
+          <w:ilvl w:val="0"/>
+          <w:numId w:val="12"/>
+        </w:numPr>
+      </w:pPr>
+      <w:r>
+        <w:t>Designed and implemented a CI-integrated automation framework using Selenium, TestNG, and Maven.</w:t>
+      </w:r>
+    </w:p>
+    <w:p>
+      <w:pPr>
+        <w:numPr>
+          <w:ilvl w:val="0"/>
+          <w:numId w:val="12"/>
+        </w:numPr>
+      </w:pPr>
+      <w:r>
+        <w:t>Built modular suites (</w:t>
+      </w:r>
+      <w:proofErr w:type="spellStart"/>
+      <w:r>
+        <w:t>HealthCheck</w:t>
+      </w:r>
+      <w:proofErr w:type="spellEnd"/>
+      <w:r>
+        <w:t>, Smoke, Regression) with traceability from SRS → Test Design → Automation.</w:t>
+      </w:r>
+    </w:p>
+    <w:p>
+      <w:pPr>
+        <w:numPr>
+          <w:ilvl w:val="0"/>
+          <w:numId w:val="12"/>
+        </w:numPr>
+      </w:pPr>
+      <w:r>
+        <w:t>Configured Jenkins pipelines and GitHub Actions for CI/CD.</w:t>
+      </w:r>
+    </w:p>
+    <w:p>
+      <w:pPr>
+        <w:numPr>
+          <w:ilvl w:val="0"/>
+          <w:numId w:val="12"/>
+        </w:numPr>
+      </w:pPr>
+      <w:r>
+        <w:t>Collaborated with AI contributors (Microsoft Copilot &amp; ChatGPT) for:</w:t>
+      </w:r>
+    </w:p>
+    <w:p>
+      <w:pPr>
+        <w:numPr>
+          <w:ilvl w:val="1"/>
+          <w:numId w:val="12"/>
+        </w:numPr>
+      </w:pPr>
+      <w:r>
+        <w:t>Mentorship in framework design, selectors, debugging.</w:t>
+      </w:r>
+    </w:p>
+    <w:p>
+      <w:pPr>
+        <w:numPr>
+          <w:ilvl w:val="1"/>
+          <w:numId w:val="12"/>
+        </w:numPr>
+      </w:pPr>
+      <w:r>
+        <w:t xml:space="preserve">Guidance on CI/CD setup and </w:t>
+      </w:r>
+      <w:proofErr w:type="spellStart"/>
+      <w:r>
+        <w:t>Jenkinsfile</w:t>
+      </w:r>
+      <w:proofErr w:type="spellEnd"/>
+      <w:r>
+        <w:t xml:space="preserve"> creation.</w:t>
+      </w:r>
+    </w:p>
+    <w:p>
+      <w:pPr>
+        <w:numPr>
+          <w:ilvl w:val="1"/>
+          <w:numId w:val="12"/>
+        </w:numPr>
+      </w:pPr>
+      <w:r>
+        <w:t>Documentation drafting, interview prep content, and best practices.</w:t>
       </w:r>
     </w:p>
     <w:p/>
@@ -1149,6 +1513,155 @@
     </w:lvl>
   </w:abstractNum>
   <w:abstractNum w:abstractNumId="4" w15:restartNumberingAfterBreak="0">
+    <w:nsid w:val="4A86425A"/>
+    <w:multiLevelType w:val="multilevel"/>
+    <w:tmpl w:val="6F5A27C0"/>
+    <w:lvl w:ilvl="0">
+      <w:start w:val="1"/>
+      <w:numFmt w:val="bullet"/>
+      <w:lvlText w:val=""/>
+      <w:lvlJc w:val="left"/>
+      <w:pPr>
+        <w:tabs>
+          <w:tab w:val="num" w:pos="720"/>
+        </w:tabs>
+        <w:ind w:left="720" w:hanging="360"/>
+      </w:pPr>
+      <w:rPr>
+        <w:rFonts w:ascii="Symbol" w:hAnsi="Symbol" w:hint="default"/>
+        <w:sz w:val="20"/>
+      </w:rPr>
+    </w:lvl>
+    <w:lvl w:ilvl="1">
+      <w:start w:val="1"/>
+      <w:numFmt w:val="bullet"/>
+      <w:lvlText w:val="o"/>
+      <w:lvlJc w:val="left"/>
+      <w:pPr>
+        <w:tabs>
+          <w:tab w:val="num" w:pos="1440"/>
+        </w:tabs>
+        <w:ind w:left="1440" w:hanging="360"/>
+      </w:pPr>
+      <w:rPr>
+        <w:rFonts w:ascii="Courier New" w:hAnsi="Courier New" w:hint="default"/>
+        <w:sz w:val="20"/>
+      </w:rPr>
+    </w:lvl>
+    <w:lvl w:ilvl="2" w:tentative="1">
+      <w:start w:val="1"/>
+      <w:numFmt w:val="bullet"/>
+      <w:lvlText w:val=""/>
+      <w:lvlJc w:val="left"/>
+      <w:pPr>
+        <w:tabs>
+          <w:tab w:val="num" w:pos="2160"/>
+        </w:tabs>
+        <w:ind w:left="2160" w:hanging="360"/>
+      </w:pPr>
+      <w:rPr>
+        <w:rFonts w:ascii="Wingdings" w:hAnsi="Wingdings" w:hint="default"/>
+        <w:sz w:val="20"/>
+      </w:rPr>
+    </w:lvl>
+    <w:lvl w:ilvl="3" w:tentative="1">
+      <w:start w:val="1"/>
+      <w:numFmt w:val="bullet"/>
+      <w:lvlText w:val=""/>
+      <w:lvlJc w:val="left"/>
+      <w:pPr>
+        <w:tabs>
+          <w:tab w:val="num" w:pos="2880"/>
+        </w:tabs>
+        <w:ind w:left="2880" w:hanging="360"/>
+      </w:pPr>
+      <w:rPr>
+        <w:rFonts w:ascii="Wingdings" w:hAnsi="Wingdings" w:hint="default"/>
+        <w:sz w:val="20"/>
+      </w:rPr>
+    </w:lvl>
+    <w:lvl w:ilvl="4" w:tentative="1">
+      <w:start w:val="1"/>
+      <w:numFmt w:val="bullet"/>
+      <w:lvlText w:val=""/>
+      <w:lvlJc w:val="left"/>
+      <w:pPr>
+        <w:tabs>
+          <w:tab w:val="num" w:pos="3600"/>
+        </w:tabs>
+        <w:ind w:left="3600" w:hanging="360"/>
+      </w:pPr>
+      <w:rPr>
+        <w:rFonts w:ascii="Wingdings" w:hAnsi="Wingdings" w:hint="default"/>
+        <w:sz w:val="20"/>
+      </w:rPr>
+    </w:lvl>
+    <w:lvl w:ilvl="5" w:tentative="1">
+      <w:start w:val="1"/>
+      <w:numFmt w:val="bullet"/>
+      <w:lvlText w:val=""/>
+      <w:lvlJc w:val="left"/>
+      <w:pPr>
+        <w:tabs>
+          <w:tab w:val="num" w:pos="4320"/>
+        </w:tabs>
+        <w:ind w:left="4320" w:hanging="360"/>
+      </w:pPr>
+      <w:rPr>
+        <w:rFonts w:ascii="Wingdings" w:hAnsi="Wingdings" w:hint="default"/>
+        <w:sz w:val="20"/>
+      </w:rPr>
+    </w:lvl>
+    <w:lvl w:ilvl="6" w:tentative="1">
+      <w:start w:val="1"/>
+      <w:numFmt w:val="bullet"/>
+      <w:lvlText w:val=""/>
+      <w:lvlJc w:val="left"/>
+      <w:pPr>
+        <w:tabs>
+          <w:tab w:val="num" w:pos="5040"/>
+        </w:tabs>
+        <w:ind w:left="5040" w:hanging="360"/>
+      </w:pPr>
+      <w:rPr>
+        <w:rFonts w:ascii="Wingdings" w:hAnsi="Wingdings" w:hint="default"/>
+        <w:sz w:val="20"/>
+      </w:rPr>
+    </w:lvl>
+    <w:lvl w:ilvl="7" w:tentative="1">
+      <w:start w:val="1"/>
+      <w:numFmt w:val="bullet"/>
+      <w:lvlText w:val=""/>
+      <w:lvlJc w:val="left"/>
+      <w:pPr>
+        <w:tabs>
+          <w:tab w:val="num" w:pos="5760"/>
+        </w:tabs>
+        <w:ind w:left="5760" w:hanging="360"/>
+      </w:pPr>
+      <w:rPr>
+        <w:rFonts w:ascii="Wingdings" w:hAnsi="Wingdings" w:hint="default"/>
+        <w:sz w:val="20"/>
+      </w:rPr>
+    </w:lvl>
+    <w:lvl w:ilvl="8" w:tentative="1">
+      <w:start w:val="1"/>
+      <w:numFmt w:val="bullet"/>
+      <w:lvlText w:val=""/>
+      <w:lvlJc w:val="left"/>
+      <w:pPr>
+        <w:tabs>
+          <w:tab w:val="num" w:pos="6480"/>
+        </w:tabs>
+        <w:ind w:left="6480" w:hanging="360"/>
+      </w:pPr>
+      <w:rPr>
+        <w:rFonts w:ascii="Wingdings" w:hAnsi="Wingdings" w:hint="default"/>
+        <w:sz w:val="20"/>
+      </w:rPr>
+    </w:lvl>
+  </w:abstractNum>
+  <w:abstractNum w:abstractNumId="5" w15:restartNumberingAfterBreak="0">
     <w:nsid w:val="4CA22861"/>
     <w:multiLevelType w:val="multilevel"/>
     <w:tmpl w:val="A5F89624"/>
@@ -1297,7 +1810,7 @@
       </w:rPr>
     </w:lvl>
   </w:abstractNum>
-  <w:abstractNum w:abstractNumId="5" w15:restartNumberingAfterBreak="0">
+  <w:abstractNum w:abstractNumId="6" w15:restartNumberingAfterBreak="0">
     <w:nsid w:val="4E7479F9"/>
     <w:multiLevelType w:val="multilevel"/>
     <w:tmpl w:val="450C2D42"/>
@@ -1446,7 +1959,7 @@
       </w:rPr>
     </w:lvl>
   </w:abstractNum>
-  <w:abstractNum w:abstractNumId="6" w15:restartNumberingAfterBreak="0">
+  <w:abstractNum w:abstractNumId="7" w15:restartNumberingAfterBreak="0">
     <w:nsid w:val="4FD268B0"/>
     <w:multiLevelType w:val="multilevel"/>
     <w:tmpl w:val="0EA40E9C"/>
@@ -1595,7 +2108,7 @@
       </w:rPr>
     </w:lvl>
   </w:abstractNum>
-  <w:abstractNum w:abstractNumId="7" w15:restartNumberingAfterBreak="0">
+  <w:abstractNum w:abstractNumId="8" w15:restartNumberingAfterBreak="0">
     <w:nsid w:val="599909D5"/>
     <w:multiLevelType w:val="multilevel"/>
     <w:tmpl w:val="B204E242"/>
@@ -1744,7 +2257,156 @@
       </w:rPr>
     </w:lvl>
   </w:abstractNum>
-  <w:abstractNum w:abstractNumId="8" w15:restartNumberingAfterBreak="0">
+  <w:abstractNum w:abstractNumId="9" w15:restartNumberingAfterBreak="0">
+    <w:nsid w:val="77F13C4B"/>
+    <w:multiLevelType w:val="multilevel"/>
+    <w:tmpl w:val="7A7C48D2"/>
+    <w:lvl w:ilvl="0">
+      <w:start w:val="1"/>
+      <w:numFmt w:val="bullet"/>
+      <w:lvlText w:val=""/>
+      <w:lvlJc w:val="left"/>
+      <w:pPr>
+        <w:tabs>
+          <w:tab w:val="num" w:pos="720"/>
+        </w:tabs>
+        <w:ind w:left="720" w:hanging="360"/>
+      </w:pPr>
+      <w:rPr>
+        <w:rFonts w:ascii="Symbol" w:hAnsi="Symbol" w:hint="default"/>
+        <w:sz w:val="20"/>
+      </w:rPr>
+    </w:lvl>
+    <w:lvl w:ilvl="1">
+      <w:start w:val="1"/>
+      <w:numFmt w:val="bullet"/>
+      <w:lvlText w:val="o"/>
+      <w:lvlJc w:val="left"/>
+      <w:pPr>
+        <w:tabs>
+          <w:tab w:val="num" w:pos="1440"/>
+        </w:tabs>
+        <w:ind w:left="1440" w:hanging="360"/>
+      </w:pPr>
+      <w:rPr>
+        <w:rFonts w:ascii="Courier New" w:hAnsi="Courier New" w:hint="default"/>
+        <w:sz w:val="20"/>
+      </w:rPr>
+    </w:lvl>
+    <w:lvl w:ilvl="2" w:tentative="1">
+      <w:start w:val="1"/>
+      <w:numFmt w:val="bullet"/>
+      <w:lvlText w:val=""/>
+      <w:lvlJc w:val="left"/>
+      <w:pPr>
+        <w:tabs>
+          <w:tab w:val="num" w:pos="2160"/>
+        </w:tabs>
+        <w:ind w:left="2160" w:hanging="360"/>
+      </w:pPr>
+      <w:rPr>
+        <w:rFonts w:ascii="Wingdings" w:hAnsi="Wingdings" w:hint="default"/>
+        <w:sz w:val="20"/>
+      </w:rPr>
+    </w:lvl>
+    <w:lvl w:ilvl="3" w:tentative="1">
+      <w:start w:val="1"/>
+      <w:numFmt w:val="bullet"/>
+      <w:lvlText w:val=""/>
+      <w:lvlJc w:val="left"/>
+      <w:pPr>
+        <w:tabs>
+          <w:tab w:val="num" w:pos="2880"/>
+        </w:tabs>
+        <w:ind w:left="2880" w:hanging="360"/>
+      </w:pPr>
+      <w:rPr>
+        <w:rFonts w:ascii="Wingdings" w:hAnsi="Wingdings" w:hint="default"/>
+        <w:sz w:val="20"/>
+      </w:rPr>
+    </w:lvl>
+    <w:lvl w:ilvl="4" w:tentative="1">
+      <w:start w:val="1"/>
+      <w:numFmt w:val="bullet"/>
+      <w:lvlText w:val=""/>
+      <w:lvlJc w:val="left"/>
+      <w:pPr>
+        <w:tabs>
+          <w:tab w:val="num" w:pos="3600"/>
+        </w:tabs>
+        <w:ind w:left="3600" w:hanging="360"/>
+      </w:pPr>
+      <w:rPr>
+        <w:rFonts w:ascii="Wingdings" w:hAnsi="Wingdings" w:hint="default"/>
+        <w:sz w:val="20"/>
+      </w:rPr>
+    </w:lvl>
+    <w:lvl w:ilvl="5" w:tentative="1">
+      <w:start w:val="1"/>
+      <w:numFmt w:val="bullet"/>
+      <w:lvlText w:val=""/>
+      <w:lvlJc w:val="left"/>
+      <w:pPr>
+        <w:tabs>
+          <w:tab w:val="num" w:pos="4320"/>
+        </w:tabs>
+        <w:ind w:left="4320" w:hanging="360"/>
+      </w:pPr>
+      <w:rPr>
+        <w:rFonts w:ascii="Wingdings" w:hAnsi="Wingdings" w:hint="default"/>
+        <w:sz w:val="20"/>
+      </w:rPr>
+    </w:lvl>
+    <w:lvl w:ilvl="6" w:tentative="1">
+      <w:start w:val="1"/>
+      <w:numFmt w:val="bullet"/>
+      <w:lvlText w:val=""/>
+      <w:lvlJc w:val="left"/>
+      <w:pPr>
+        <w:tabs>
+          <w:tab w:val="num" w:pos="5040"/>
+        </w:tabs>
+        <w:ind w:left="5040" w:hanging="360"/>
+      </w:pPr>
+      <w:rPr>
+        <w:rFonts w:ascii="Wingdings" w:hAnsi="Wingdings" w:hint="default"/>
+        <w:sz w:val="20"/>
+      </w:rPr>
+    </w:lvl>
+    <w:lvl w:ilvl="7" w:tentative="1">
+      <w:start w:val="1"/>
+      <w:numFmt w:val="bullet"/>
+      <w:lvlText w:val=""/>
+      <w:lvlJc w:val="left"/>
+      <w:pPr>
+        <w:tabs>
+          <w:tab w:val="num" w:pos="5760"/>
+        </w:tabs>
+        <w:ind w:left="5760" w:hanging="360"/>
+      </w:pPr>
+      <w:rPr>
+        <w:rFonts w:ascii="Wingdings" w:hAnsi="Wingdings" w:hint="default"/>
+        <w:sz w:val="20"/>
+      </w:rPr>
+    </w:lvl>
+    <w:lvl w:ilvl="8" w:tentative="1">
+      <w:start w:val="1"/>
+      <w:numFmt w:val="bullet"/>
+      <w:lvlText w:val=""/>
+      <w:lvlJc w:val="left"/>
+      <w:pPr>
+        <w:tabs>
+          <w:tab w:val="num" w:pos="6480"/>
+        </w:tabs>
+        <w:ind w:left="6480" w:hanging="360"/>
+      </w:pPr>
+      <w:rPr>
+        <w:rFonts w:ascii="Wingdings" w:hAnsi="Wingdings" w:hint="default"/>
+        <w:sz w:val="20"/>
+      </w:rPr>
+    </w:lvl>
+  </w:abstractNum>
+  <w:abstractNum w:abstractNumId="10" w15:restartNumberingAfterBreak="0">
     <w:nsid w:val="7B0663C7"/>
     <w:multiLevelType w:val="multilevel"/>
     <w:tmpl w:val="24D67CEE"/>
@@ -1893,7 +2555,7 @@
       </w:rPr>
     </w:lvl>
   </w:abstractNum>
-  <w:abstractNum w:abstractNumId="9" w15:restartNumberingAfterBreak="0">
+  <w:abstractNum w:abstractNumId="11" w15:restartNumberingAfterBreak="0">
     <w:nsid w:val="7B12461C"/>
     <w:multiLevelType w:val="multilevel"/>
     <w:tmpl w:val="C5BEA954"/>
@@ -2043,10 +2705,10 @@
     </w:lvl>
   </w:abstractNum>
   <w:num w:numId="1" w16cid:durableId="1511137754">
-    <w:abstractNumId w:val="6"/>
+    <w:abstractNumId w:val="7"/>
   </w:num>
   <w:num w:numId="2" w16cid:durableId="1288049792">
-    <w:abstractNumId w:val="7"/>
+    <w:abstractNumId w:val="8"/>
   </w:num>
   <w:num w:numId="3" w16cid:durableId="550507314">
     <w:abstractNumId w:val="2"/>
@@ -2058,19 +2720,25 @@
     <w:abstractNumId w:val="1"/>
   </w:num>
   <w:num w:numId="6" w16cid:durableId="322047364">
-    <w:abstractNumId w:val="8"/>
+    <w:abstractNumId w:val="10"/>
   </w:num>
   <w:num w:numId="7" w16cid:durableId="70978688">
     <w:abstractNumId w:val="3"/>
   </w:num>
   <w:num w:numId="8" w16cid:durableId="1101758190">
+    <w:abstractNumId w:val="6"/>
+  </w:num>
+  <w:num w:numId="9" w16cid:durableId="1161853232">
     <w:abstractNumId w:val="5"/>
   </w:num>
-  <w:num w:numId="9" w16cid:durableId="1161853232">
+  <w:num w:numId="10" w16cid:durableId="1313103449">
+    <w:abstractNumId w:val="11"/>
+  </w:num>
+  <w:num w:numId="11" w16cid:durableId="2071491419">
+    <w:abstractNumId w:val="9"/>
+  </w:num>
+  <w:num w:numId="12" w16cid:durableId="1007681789">
     <w:abstractNumId w:val="4"/>
-  </w:num>
-  <w:num w:numId="10" w16cid:durableId="1313103449">
-    <w:abstractNumId w:val="9"/>
   </w:num>
 </w:numbering>
 </file>

</xml_diff>